<commit_message>
fix(backup): isolate restore account and replay order
</commit_message>
<xml_diff>
--- a/jackyun-portal/docs/sync-v5-full-data-recovery-progress-3.58.0-20261028.docx
+++ b/jackyun-portal/docs/sync-v5-full-data-recovery-progress-3.58.0-20261028.docx
@@ -497,7 +497,7 @@
     </w:p>
     <w:p>
       <w:r>
-        <w:t xml:space="preserve">恢复先在目标账号同步 IndexedDB 的单个 readwrite 事务内读取当前队列、持久化队列/冲突恢复点，再合并归档记录。操作按 ID 幂等；遗留操作的本机 sequence/retry 顺序优先保留；同 ID 但业务内容不同会 abort，既不覆盖当前队列也不创建不完整恢复点。恢复点最多保留 10 份。成功后界面触发后台同步重试。</w:t>
+        <w:t xml:space="preserve">恢复先在目标账号同步 IndexedDB 的单个 readwrite 事务内读取当前队列、持久化队列/冲突恢复点，再合并归档记录。操作按 ID 幂等；遗留操作的本机 sequence/retry 顺序优先保留；同 ID 但业务内容不同会 abort，既不覆盖当前队列也不创建不完整恢复点。恢复点最多保留 10 份。工作区导入固定仓库账号和 v5 目标数据库；异步过程中切换账号会终止流程且绝不通过全局存储句柄回滚到新账号。离线队列以原 sequence 为主、创建时间为回退排序，避免恢复后同一对象的状态操作倒序。成功后界面触发后台同步重试。</w:t>
       </w:r>
     </w:p>
     <w:p>
@@ -516,7 +516,7 @@
     </w:p>
     <w:p>
       <w:r>
-        <w:t xml:space="preserve">本机验证：workspace archive 与 update history 定向测试 10/10；TypeScript --noEmit、定向 ESLint 通过；完整 test:sync 308/308 通过。大于 1 MB Schedule 归档、哈希/损坏检查、IndexedDB 落盘失败保护、离线快照/操作和 v4/v5 待办/冲突归档均有测试覆盖。</w:t>
+        <w:t xml:space="preserve">本机验证：workspace archive 与 update history 定向测试 11/11；TypeScript --noEmit、定向 ESLint 通过；完整 test:sync 309/309 通过。大于 1 MB Schedule 归档、哈希/损坏检查、IndexedDB 落盘失败保护、账号切换隔离、离线重放顺序、离线快照/操作和 v4/v5 待办/冲突归档均有测试覆盖。</w:t>
       </w:r>
     </w:p>
     <w:p>

</xml_diff>